<commit_message>
Enhance API error handling and multipart form data management
- Introduced a centralized error handling function to improve API error messaging across various API calls.
- Updated the `sendPhoneVerificationApi`, `completeProfileApi`, and `updateProfessionalProfileApi` functions to handle multipart form data more reliably, ensuring proper image uploads and JSON handling based on the presence of local images.
- Enhanced the `showInterestOnJobApi` to accept a new `priceOption` parameter, allowing users to specify how they wish to propose a price.
- Added a new `updateReviewApi` function to enable users to update existing reviews, improving user interaction with job feedback.
- Refactored the `ShowInterestSheet` and `VerifyWorkerSheet` components to support new functionalities and improve user experience during job interest submissions and worker verification processes.
</commit_message>
<xml_diff>
--- a/MakeMyTask_Client_Feedback_Plan.docx
+++ b/MakeMyTask_Client_Feedback_Plan.docx
@@ -5836,6 +5836,13 @@
     </w:rPrDefault>
     <w:pPrDefault/>
   </w:docDefaults>
+  <w:style w:type="paragraph" w:default="1" w:styleId="Normal">
+    <w:name w:val="Normal"/>
+    <w:qFormat/>
+  </w:style>
+  <w:style w:type="character" w:default="1" w:styleId="DefaultParagraphFont">
+    <w:name w:val="Default Paragraph Font"/>
+  </w:style>
   <w:style w:type="paragraph" w:styleId="Title">
     <w:name w:val="Title"/>
     <w:basedOn w:val="Normal"/>

</xml_diff>